<commit_message>
Honcho Requirements: Core chapters as numbered requirements checked against the code (logins, permissions, member records, settings, library, website, help); Member Guide no longer offers self-registration; to-do findings
Co-Authored-By: Claude Opus 5.5 <noreply@anthropic.com>
</commit_message>
<xml_diff>
--- a/docs/member-guide/Honcho_Member_Guide.docx
+++ b/docs/member-guide/Honcho_Member_Guide.docx
@@ -45,13 +45,13 @@
           <w:sz w:val="20"/>
           <w:szCs w:val="20"/>
         </w:rPr>
-        <w:t xml:space="preserve">Generated 2026-10-29</w:t>
+        <w:t xml:space="preserve">Generated 2026-10-30</w:t>
       </w:r>
     </w:p>
     <w:p>
       <w:pPr>
         <w:pageBreakBefore/>
-        <w:spacing w:after="600" w:before="2400"/>
+        <w:spacing w:before="2400" w:after="600"/>
       </w:pPr>
       <w:r>
         <w:rPr>
@@ -69,7 +69,7 @@
       <w:pPr>
         <w:pStyle w:val="Heading1"/>
         <w:pageBreakBefore/>
-        <w:spacing w:after="300" w:before="0"/>
+        <w:spacing w:before="0" w:after="300"/>
       </w:pPr>
       <w:r>
         <w:t xml:space="preserve">Chapter 1: Getting Started</w:t>
@@ -81,7 +81,7 @@
         <w:pBdr>
           <w:bottom w:val="single" w:color="2C3E50" w:sz="6" w:space="8"/>
         </w:pBdr>
-        <w:spacing w:after="240" w:before="0"/>
+        <w:spacing w:before="0" w:after="240"/>
       </w:pPr>
       <w:r>
         <w:t xml:space="preserve">Who This Guide Is For</w:t>
@@ -164,7 +164,7 @@
     </w:p>
     <w:tbl>
       <w:tblPr>
-        <w:tblW w:type="pct" w:w="5000"/>
+        <w:tblW w:type="pct" w:w="100%"/>
         <w:tblBorders>
           <w:top w:val="single" w:color="5BC0DE" w:sz="4"/>
           <w:left w:val="single" w:color="5BC0DE" w:sz="4"/>
@@ -175,12 +175,12 @@
         </w:tblBorders>
       </w:tblPr>
       <w:tblGrid>
-        <w:gridCol w:w="9360"/>
+        <w:gridCol w:w="100"/>
       </w:tblGrid>
       <w:tr>
         <w:tc>
           <w:tcPr>
-            <w:tcW w:type="pct" w:w="5000"/>
+            <w:tcW w:type="pct" w:w="100%"/>
             <w:shd w:fill="D9EDF7" w:val="clear"/>
             <w:tcMar>
               <w:top w:type="dxa" w:w="160"/>
@@ -236,7 +236,7 @@
         <w:pBdr>
           <w:bottom w:val="single" w:color="2C3E50" w:sz="6" w:space="8"/>
         </w:pBdr>
-        <w:spacing w:after="240" w:before="500"/>
+        <w:spacing w:before="500" w:after="240"/>
       </w:pPr>
       <w:r>
         <w:t xml:space="preserve">Logging In</w:t>
@@ -245,7 +245,7 @@
     <w:p>
       <w:pPr>
         <w:pStyle w:val="Heading3"/>
-        <w:spacing w:after="160" w:before="320"/>
+        <w:spacing w:before="320" w:after="160"/>
       </w:pPr>
       <w:r>
         <w:t xml:space="preserve">Member Portal Login</w:t>
@@ -457,10 +457,10 @@
     <w:p>
       <w:pPr>
         <w:pStyle w:val="Heading3"/>
-        <w:spacing w:after="160" w:before="320"/>
-      </w:pPr>
-      <w:r>
-        <w:t xml:space="preserve">Creating an Account</w:t>
+        <w:spacing w:before="320" w:after="160"/>
+      </w:pPr>
+      <w:r>
+        <w:t xml:space="preserve">Getting an Account</w:t>
       </w:r>
     </w:p>
     <w:p>
@@ -471,27 +471,13 @@
         <w:rPr>
           <w:rFonts w:ascii="Calibri" w:cs="Calibri" w:eastAsia="Calibri" w:hAnsi="Calibri"/>
         </w:rPr>
-        <w:t xml:space="preserve">If you're a member but have never logged in, click </w:t>
-      </w:r>
-      <w:r>
-        <w:rPr>
-          <w:rFonts w:ascii="Calibri" w:cs="Calibri" w:eastAsia="Calibri" w:hAnsi="Calibri"/>
-          <w:b/>
-          <w:bCs/>
-        </w:rPr>
-        <w:t xml:space="preserve">Create an account</w:t>
-      </w:r>
-      <w:r>
-        <w:rPr>
-          <w:rFonts w:ascii="Calibri" w:cs="Calibri" w:eastAsia="Calibri" w:hAnsi="Calibri"/>
-        </w:rPr>
-        <w:t xml:space="preserve"> on the login page. Enter your email address as your username, choose a password, repeat it and submit.</w:t>
+        <w:t xml:space="preserve">Your login is created for you by your Chapter Admin or the membership office; you can't create one yourself on the login page. If you're a member and have never logged in, ask your Chapter Admin for your username and starting password.</w:t>
       </w:r>
     </w:p>
     <w:p>
       <w:pPr>
         <w:pStyle w:val="Heading3"/>
-        <w:spacing w:after="160" w:before="320"/>
+        <w:spacing w:before="320" w:after="160"/>
       </w:pPr>
       <w:r>
         <w:t xml:space="preserve">Forgot Your Password?</w:t>
@@ -538,7 +524,7 @@
     </w:p>
     <w:tbl>
       <w:tblPr>
-        <w:tblW w:type="pct" w:w="5000"/>
+        <w:tblW w:type="pct" w:w="100%"/>
         <w:tblBorders>
           <w:top w:val="single" w:color="E8A33D" w:sz="4"/>
           <w:left w:val="single" w:color="E8A33D" w:sz="4"/>
@@ -549,12 +535,12 @@
         </w:tblBorders>
       </w:tblPr>
       <w:tblGrid>
-        <w:gridCol w:w="9360"/>
+        <w:gridCol w:w="100"/>
       </w:tblGrid>
       <w:tr>
         <w:tc>
           <w:tcPr>
-            <w:tcW w:type="pct" w:w="5000"/>
+            <w:tcW w:type="pct" w:w="100%"/>
             <w:shd w:fill="FCF1DC" w:val="clear"/>
             <w:tcMar>
               <w:top w:type="dxa" w:w="160"/>
@@ -585,7 +571,7 @@
     <w:p>
       <w:pPr>
         <w:pStyle w:val="Heading3"/>
-        <w:spacing w:after="160" w:before="320"/>
+        <w:spacing w:before="320" w:after="160"/>
       </w:pPr>
       <w:r>
         <w:t xml:space="preserve">Staying Logged In and Logging Out</w:t>
@@ -636,7 +622,7 @@
         <w:pBdr>
           <w:bottom w:val="single" w:color="2C3E50" w:sz="6" w:space="8"/>
         </w:pBdr>
-        <w:spacing w:after="240" w:before="500"/>
+        <w:spacing w:before="500" w:after="240"/>
       </w:pPr>
       <w:r>
         <w:t xml:space="preserve">Finding Your Way Around</w:t>
@@ -645,7 +631,7 @@
     <w:p>
       <w:pPr>
         <w:pStyle w:val="Heading3"/>
-        <w:spacing w:after="160" w:before="320"/>
+        <w:spacing w:before="320" w:after="160"/>
       </w:pPr>
       <w:r>
         <w:t xml:space="preserve">The Home Page</w:t>
@@ -1234,7 +1220,7 @@
     <w:p>
       <w:pPr>
         <w:pStyle w:val="Heading3"/>
-        <w:spacing w:after="160" w:before="320"/>
+        <w:spacing w:before="320" w:after="160"/>
       </w:pPr>
       <w:r>
         <w:t xml:space="preserve">Help</w:t>
@@ -1268,7 +1254,7 @@
     <w:p>
       <w:pPr>
         <w:pStyle w:val="Heading3"/>
-        <w:spacing w:after="160" w:before="320"/>
+        <w:spacing w:before="320" w:after="160"/>
       </w:pPr>
       <w:r>
         <w:t xml:space="preserve">Text Size</w:t>
@@ -1347,7 +1333,7 @@
         <w:pBdr>
           <w:bottom w:val="single" w:color="2C3E50" w:sz="6" w:space="8"/>
         </w:pBdr>
-        <w:spacing w:after="240" w:before="500"/>
+        <w:spacing w:before="500" w:after="240"/>
       </w:pPr>
       <w:r>
         <w:t xml:space="preserve">The Mobile App</w:t>
@@ -1809,7 +1795,7 @@
     <w:p>
       <w:pPr>
         <w:pageBreakBefore/>
-        <w:spacing w:after="600" w:before="2400"/>
+        <w:spacing w:before="2400" w:after="600"/>
       </w:pPr>
       <w:r>
         <w:rPr>
@@ -1827,7 +1813,7 @@
       <w:pPr>
         <w:pStyle w:val="Heading1"/>
         <w:pageBreakBefore/>
-        <w:spacing w:after="300" w:before="0"/>
+        <w:spacing w:before="0" w:after="300"/>
       </w:pPr>
       <w:r>
         <w:t xml:space="preserve">Chapter 2: For Every Member</w:t>
@@ -1839,7 +1825,7 @@
         <w:pBdr>
           <w:bottom w:val="single" w:color="2C3E50" w:sz="6" w:space="8"/>
         </w:pBdr>
-        <w:spacing w:after="240" w:before="0"/>
+        <w:spacing w:before="0" w:after="240"/>
       </w:pPr>
       <w:r>
         <w:t xml:space="preserve">My Profile</w:t>
@@ -2402,7 +2388,7 @@
     <w:p>
       <w:pPr>
         <w:pStyle w:val="Heading3"/>
-        <w:spacing w:after="160" w:before="320"/>
+        <w:spacing w:before="320" w:after="160"/>
       </w:pPr>
       <w:r>
         <w:t xml:space="preserve">Updating Your Profile</w:t>
@@ -2517,7 +2503,7 @@
     <w:p>
       <w:pPr>
         <w:pStyle w:val="Heading3"/>
-        <w:spacing w:after="160" w:before="320"/>
+        <w:spacing w:before="320" w:after="160"/>
       </w:pPr>
       <w:r>
         <w:t xml:space="preserve">Your Aircraft</w:t>
@@ -2551,7 +2537,7 @@
     <w:p>
       <w:pPr>
         <w:pStyle w:val="Heading3"/>
-        <w:spacing w:after="160" w:before="320"/>
+        <w:spacing w:before="320" w:after="160"/>
       </w:pPr>
       <w:r>
         <w:t xml:space="preserve">Text Size</w:t>
@@ -2613,7 +2599,7 @@
     <w:p>
       <w:pPr>
         <w:pStyle w:val="Heading3"/>
-        <w:spacing w:after="160" w:before="320"/>
+        <w:spacing w:before="320" w:after="160"/>
       </w:pPr>
       <w:r>
         <w:t xml:space="preserve">Contact Preferences</w:t>
@@ -2751,7 +2737,7 @@
         <w:pBdr>
           <w:bottom w:val="single" w:color="2C3E50" w:sz="6" w:space="8"/>
         </w:pBdr>
-        <w:spacing w:after="240" w:before="500"/>
+        <w:spacing w:before="500" w:after="240"/>
       </w:pPr>
       <w:r>
         <w:t xml:space="preserve">Your Membership Card</w:t>
@@ -2821,7 +2807,7 @@
     <w:p>
       <w:pPr>
         <w:pStyle w:val="Heading3"/>
-        <w:spacing w:after="160" w:before="320"/>
+        <w:spacing w:before="320" w:after="160"/>
       </w:pPr>
       <w:r>
         <w:t xml:space="preserve">Lost Your Phone?</w:t>
@@ -2868,7 +2854,7 @@
     </w:p>
     <w:tbl>
       <w:tblPr>
-        <w:tblW w:type="pct" w:w="5000"/>
+        <w:tblW w:type="pct" w:w="100%"/>
         <w:tblBorders>
           <w:top w:val="single" w:color="5BC0DE" w:sz="4"/>
           <w:left w:val="single" w:color="5BC0DE" w:sz="4"/>
@@ -2879,12 +2865,12 @@
         </w:tblBorders>
       </w:tblPr>
       <w:tblGrid>
-        <w:gridCol w:w="9360"/>
+        <w:gridCol w:w="100"/>
       </w:tblGrid>
       <w:tr>
         <w:tc>
           <w:tcPr>
-            <w:tcW w:type="pct" w:w="5000"/>
+            <w:tcW w:type="pct" w:w="100%"/>
             <w:shd w:fill="D9EDF7" w:val="clear"/>
             <w:tcMar>
               <w:top w:type="dxa" w:w="160"/>
@@ -2932,7 +2918,7 @@
         <w:pBdr>
           <w:bottom w:val="single" w:color="2C3E50" w:sz="6" w:space="8"/>
         </w:pBdr>
-        <w:spacing w:after="240" w:before="500"/>
+        <w:spacing w:before="500" w:after="240"/>
       </w:pPr>
       <w:r>
         <w:t xml:space="preserve">Membership Status</w:t>
@@ -3312,7 +3298,7 @@
         <w:pBdr>
           <w:bottom w:val="single" w:color="2C3E50" w:sz="6" w:space="8"/>
         </w:pBdr>
-        <w:spacing w:after="240" w:before="500"/>
+        <w:spacing w:before="500" w:after="240"/>
       </w:pPr>
       <w:r>
         <w:t xml:space="preserve">Rosters and the Directory</w:t>
@@ -3576,7 +3562,7 @@
     </w:p>
     <w:tbl>
       <w:tblPr>
-        <w:tblW w:type="pct" w:w="5000"/>
+        <w:tblW w:type="pct" w:w="100%"/>
         <w:tblBorders>
           <w:top w:val="single" w:color="5BC0DE" w:sz="4"/>
           <w:left w:val="single" w:color="5BC0DE" w:sz="4"/>
@@ -3587,12 +3573,12 @@
         </w:tblBorders>
       </w:tblPr>
       <w:tblGrid>
-        <w:gridCol w:w="9360"/>
+        <w:gridCol w:w="100"/>
       </w:tblGrid>
       <w:tr>
         <w:tc>
           <w:tcPr>
-            <w:tcW w:type="pct" w:w="5000"/>
+            <w:tcW w:type="pct" w:w="100%"/>
             <w:shd w:fill="D9EDF7" w:val="clear"/>
             <w:tcMar>
               <w:top w:type="dxa" w:w="160"/>
@@ -3626,7 +3612,7 @@
         <w:pBdr>
           <w:bottom w:val="single" w:color="2C3E50" w:sz="6" w:space="8"/>
         </w:pBdr>
-        <w:spacing w:after="240" w:before="500"/>
+        <w:spacing w:before="500" w:after="240"/>
       </w:pPr>
       <w:r>
         <w:t xml:space="preserve">Library, News and Events</w:t>
@@ -4014,7 +4000,7 @@
       <w:pPr>
         <w:pStyle w:val="Heading1"/>
         <w:pageBreakBefore/>
-        <w:spacing w:after="300" w:before="0"/>
+        <w:spacing w:before="0" w:after="300"/>
       </w:pPr>
       <w:r>
         <w:t xml:space="preserve">Chapter 3: Document Library</w:t>
@@ -4026,7 +4012,7 @@
         <w:pBdr>
           <w:bottom w:val="single" w:color="2C3E50" w:sz="6" w:space="8"/>
         </w:pBdr>
-        <w:spacing w:after="240" w:before="0"/>
+        <w:spacing w:before="0" w:after="240"/>
       </w:pPr>
       <w:r>
         <w:t xml:space="preserve">Finding Documents</w:t>
@@ -4127,7 +4113,7 @@
     <w:p>
       <w:pPr>
         <w:pStyle w:val="Heading3"/>
-        <w:spacing w:after="160" w:before="320"/>
+        <w:spacing w:before="320" w:after="160"/>
       </w:pPr>
       <w:r>
         <w:t xml:space="preserve">Filters</w:t>
@@ -4403,7 +4389,7 @@
     <w:p>
       <w:pPr>
         <w:pStyle w:val="Heading3"/>
-        <w:spacing w:after="160" w:before="320"/>
+        <w:spacing w:before="320" w:after="160"/>
       </w:pPr>
       <w:r>
         <w:t xml:space="preserve">Opening a Document</w:t>
@@ -4430,41 +4416,8 @@
 </w:document>
 </file>
 
-<file path=word/endnotes.xml><?xml version="1.0" encoding="utf-8"?>
-<w:endnotes xmlns:wpc="http://schemas.microsoft.com/office/word/2010/wordprocessingCanvas" xmlns:mc="http://schemas.openxmlformats.org/markup-compatibility/2006" xmlns:o="urn:schemas-microsoft-com:office:office" xmlns:r="http://schemas.openxmlformats.org/officeDocument/2006/relationships" xmlns:m="http://schemas.openxmlformats.org/officeDocument/2006/math" xmlns:v="urn:schemas-microsoft-com:vml" xmlns:wp14="http://schemas.microsoft.com/office/word/2010/wordprocessingDrawing" xmlns:wp="http://schemas.openxmlformats.org/drawingml/2006/wordprocessingDrawing" xmlns:w10="urn:schemas-microsoft-com:office:word" xmlns:w="http://schemas.openxmlformats.org/wordprocessingml/2006/main" xmlns:w14="http://schemas.microsoft.com/office/word/2010/wordml" xmlns:w15="http://schemas.microsoft.com/office/word/2012/wordml" xmlns:wpg="http://schemas.microsoft.com/office/word/2010/wordprocessingGroup" xmlns:wpi="http://schemas.microsoft.com/office/word/2010/wordprocessingInk" xmlns:wne="http://schemas.microsoft.com/office/word/2006/wordml" xmlns:wps="http://schemas.microsoft.com/office/word/2010/wordprocessingShape" mc:Ignorable="w14 w15 wp14">
-  <w:endnote w:type="separator" w:id="-1">
-    <w:p>
-      <w:pPr>
-        <w:spacing w:after="0" w:line="240" w:lineRule="auto"/>
-      </w:pPr>
-      <w:r>
-        <w:rPr>
-          <w:rStyle w:val="EndnoteReference"/>
-        </w:rPr>
-        <w:endnoteRef/>
-      </w:r>
-      <w:r>
-        <w:separator/>
-      </w:r>
-    </w:p>
-  </w:endnote>
-  <w:endnote w:type="continuationSeparator" w:id="0">
-    <w:p>
-      <w:pPr>
-        <w:spacing w:after="0" w:line="240" w:lineRule="auto"/>
-      </w:pPr>
-      <w:r>
-        <w:rPr>
-          <w:rStyle w:val="EndnoteReference"/>
-        </w:rPr>
-        <w:endnoteRef/>
-      </w:r>
-      <w:r>
-        <w:continuationSeparator/>
-      </w:r>
-    </w:p>
-  </w:endnote>
-</w:endnotes>
+<file path=word/comments.xml><?xml version="1.0" encoding="utf-8"?>
+<w:comments xmlns:cx="http://schemas.microsoft.com/office/drawing/2014/chartex" xmlns:cx1="http://schemas.microsoft.com/office/drawing/2015/9/8/chartex" xmlns:cx2="http://schemas.microsoft.com/office/drawing/2015/10/21/chartex" xmlns:cx3="http://schemas.microsoft.com/office/drawing/2016/5/9/chartex" xmlns:cx4="http://schemas.microsoft.com/office/drawing/2016/5/10/chartex" xmlns:cx5="http://schemas.microsoft.com/office/drawing/2016/5/11/chartex" xmlns:cx6="http://schemas.microsoft.com/office/drawing/2016/5/12/chartex" xmlns:cx7="http://schemas.microsoft.com/office/drawing/2016/5/13/chartex" xmlns:cx8="http://schemas.microsoft.com/office/drawing/2016/5/14/chartex" xmlns:mc="http://schemas.openxmlformats.org/markup-compatibility/2006" xmlns:aink="http://schemas.microsoft.com/office/drawing/2016/ink" xmlns:am3d="http://schemas.microsoft.com/office/drawing/2017/model3d" xmlns:o="urn:schemas-microsoft-com:office:office" xmlns:r="http://schemas.openxmlformats.org/officeDocument/2006/relationships" xmlns:m="http://schemas.openxmlformats.org/officeDocument/2006/math" xmlns:v="urn:schemas-microsoft-com:vml" xmlns:wp14="http://schemas.microsoft.com/office/word/2010/wordprocessingDrawing" xmlns:wp="http://schemas.openxmlformats.org/drawingml/2006/wordprocessingDrawing" xmlns:w10="urn:schemas-microsoft-com:office:word" xmlns:w="http://schemas.openxmlformats.org/wordprocessingml/2006/main" xmlns:w14="http://schemas.microsoft.com/office/word/2010/wordml" xmlns:w15="http://schemas.microsoft.com/office/word/2012/wordml" xmlns:w16cex="http://schemas.microsoft.com/office/word/2018/wordml/cex" xmlns:w16cid="http://schemas.microsoft.com/office/word/2016/wordml/cid" xmlns:w16="http://schemas.microsoft.com/office/word/2018/wordml" xmlns:w16sdtdh="http://schemas.microsoft.com/office/word/2020/wordml/sdtdatahash" xmlns:w16se="http://schemas.microsoft.com/office/word/2015/wordml/symex" xmlns:wpg="http://schemas.microsoft.com/office/word/2010/wordprocessingGroup" xmlns:wpi="http://schemas.microsoft.com/office/word/2010/wordprocessingInk" xmlns:wne="http://schemas.microsoft.com/office/word/2006/wordml" xmlns:wps="http://schemas.microsoft.com/office/word/2010/wordprocessingShape"/>
 </file>
 
 <file path=word/footnotes.xml><?xml version="1.0" encoding="utf-8"?>
@@ -4508,7 +4461,7 @@
 <w:numbering xmlns:wpc="http://schemas.microsoft.com/office/word/2010/wordprocessingCanvas" xmlns:mc="http://schemas.openxmlformats.org/markup-compatibility/2006" xmlns:o="urn:schemas-microsoft-com:office:office" xmlns:r="http://schemas.openxmlformats.org/officeDocument/2006/relationships" xmlns:m="http://schemas.openxmlformats.org/officeDocument/2006/math" xmlns:v="urn:schemas-microsoft-com:vml" xmlns:wp14="http://schemas.microsoft.com/office/word/2010/wordprocessingDrawing" xmlns:wp="http://schemas.openxmlformats.org/drawingml/2006/wordprocessingDrawing" xmlns:w10="urn:schemas-microsoft-com:office:word" xmlns:w="http://schemas.openxmlformats.org/wordprocessingml/2006/main" xmlns:w14="http://schemas.microsoft.com/office/word/2010/wordml" xmlns:w15="http://schemas.microsoft.com/office/word/2012/wordml" xmlns:wpg="http://schemas.microsoft.com/office/word/2010/wordprocessingGroup" xmlns:wpi="http://schemas.microsoft.com/office/word/2010/wordprocessingInk" xmlns:wne="http://schemas.microsoft.com/office/word/2006/wordml" xmlns:wps="http://schemas.microsoft.com/office/word/2010/wordprocessingShape" mc:Ignorable="w14 w15 wp14">
   <w:abstractNum w:abstractNumId="1" w15:restartNumberingAfterBreak="0">
     <w:multiLevelType w:val="hybridMultilevel"/>
-    <w:lvl w:ilvl="0" w:tentative="1">
+    <w:lvl w:ilvl="0" w15:tentative="1">
       <w:start w:val="1"/>
       <w:numFmt w:val="bullet"/>
       <w:lvlText w:val="●"/>
@@ -4517,7 +4470,7 @@
         <w:ind w:left="720" w:hanging="360"/>
       </w:pPr>
     </w:lvl>
-    <w:lvl w:ilvl="1" w:tentative="1">
+    <w:lvl w:ilvl="1" w15:tentative="1">
       <w:start w:val="1"/>
       <w:numFmt w:val="bullet"/>
       <w:lvlText w:val="○"/>
@@ -4526,7 +4479,7 @@
         <w:ind w:left="1440" w:hanging="360"/>
       </w:pPr>
     </w:lvl>
-    <w:lvl w:ilvl="2" w:tentative="1">
+    <w:lvl w:ilvl="2" w15:tentative="1">
       <w:start w:val="1"/>
       <w:numFmt w:val="bullet"/>
       <w:lvlText w:val="■"/>
@@ -4535,7 +4488,7 @@
         <w:ind w:left="2160" w:hanging="360"/>
       </w:pPr>
     </w:lvl>
-    <w:lvl w:ilvl="3" w:tentative="1">
+    <w:lvl w:ilvl="3" w15:tentative="1">
       <w:start w:val="1"/>
       <w:numFmt w:val="bullet"/>
       <w:lvlText w:val="●"/>
@@ -4544,7 +4497,7 @@
         <w:ind w:left="2880" w:hanging="360"/>
       </w:pPr>
     </w:lvl>
-    <w:lvl w:ilvl="4" w:tentative="1">
+    <w:lvl w:ilvl="4" w15:tentative="1">
       <w:start w:val="1"/>
       <w:numFmt w:val="bullet"/>
       <w:lvlText w:val="○"/>
@@ -4553,7 +4506,7 @@
         <w:ind w:left="3600" w:hanging="360"/>
       </w:pPr>
     </w:lvl>
-    <w:lvl w:ilvl="5" w:tentative="1">
+    <w:lvl w:ilvl="5" w15:tentative="1">
       <w:start w:val="1"/>
       <w:numFmt w:val="bullet"/>
       <w:lvlText w:val="■"/>
@@ -4562,7 +4515,7 @@
         <w:ind w:left="4320" w:hanging="360"/>
       </w:pPr>
     </w:lvl>
-    <w:lvl w:ilvl="6" w:tentative="1">
+    <w:lvl w:ilvl="6" w15:tentative="1">
       <w:start w:val="1"/>
       <w:numFmt w:val="bullet"/>
       <w:lvlText w:val="●"/>
@@ -4571,7 +4524,7 @@
         <w:ind w:left="5040" w:hanging="360"/>
       </w:pPr>
     </w:lvl>
-    <w:lvl w:ilvl="7" w:tentative="1">
+    <w:lvl w:ilvl="7" w15:tentative="1">
       <w:start w:val="1"/>
       <w:numFmt w:val="bullet"/>
       <w:lvlText w:val="●"/>
@@ -4580,7 +4533,7 @@
         <w:ind w:left="5760" w:hanging="360"/>
       </w:pPr>
     </w:lvl>
-    <w:lvl w:ilvl="8" w:tentative="1">
+    <w:lvl w:ilvl="8" w15:tentative="1">
       <w:start w:val="1"/>
       <w:numFmt w:val="bullet"/>
       <w:lvlText w:val="●"/>
@@ -4592,7 +4545,7 @@
   </w:abstractNum>
   <w:abstractNum w:abstractNumId="2" w15:restartNumberingAfterBreak="0">
     <w:multiLevelType w:val="hybridMultilevel"/>
-    <w:lvl w:ilvl="0" w:tentative="1">
+    <w:lvl w:ilvl="0" w15:tentative="1">
       <w:start w:val="1"/>
       <w:numFmt w:val="bullet"/>
       <w:lvlText w:val="•"/>
@@ -4604,7 +4557,7 @@
   </w:abstractNum>
   <w:abstractNum w:abstractNumId="3" w15:restartNumberingAfterBreak="0">
     <w:multiLevelType w:val="hybridMultilevel"/>
-    <w:lvl w:ilvl="0" w:tentative="1">
+    <w:lvl w:ilvl="0" w15:tentative="1">
       <w:start w:val="1"/>
       <w:numFmt w:val="decimal"/>
       <w:lvlText w:val="%1."/>
@@ -4647,25 +4600,6 @@
     </w:rPrDefault>
     <w:pPrDefault/>
   </w:docDefaults>
-  <w:style w:type="paragraph" w:styleId="Normal" w:default="1">
-    <w:name w:val="Normal"/>
-    <w:qFormat/>
-  </w:style>
-  <w:style w:type="table" w:styleId="TableNormal" w:default="true">
-    <w:name w:val="Normal Table"/>
-    <w:uiPriority w:val="99"/>
-    <w:semiHidden/>
-    <w:unhideWhenUsed/>
-    <w:tblPr>
-      <w:tblInd w:type="dxa" w:w="0"/>
-      <w:tblCellMar>
-        <w:top w:type="dxa" w:w="0"/>
-        <w:left w:type="dxa" w:w="108"/>
-        <w:bottom w:type="dxa" w:w="0"/>
-        <w:right w:type="dxa" w:w="108"/>
-      </w:tblCellMar>
-    </w:tblPr>
-  </w:style>
   <w:style w:type="paragraph" w:styleId="Title">
     <w:name w:val="Title"/>
     <w:basedOn w:val="Normal"/>
@@ -4674,6 +4608,50 @@
     <w:rPr>
       <w:sz w:val="56"/>
       <w:szCs w:val="56"/>
+    </w:rPr>
+  </w:style>
+  <w:style w:type="paragraph" w:styleId="Heading1">
+    <w:name w:val="Heading 1"/>
+    <w:basedOn w:val="Normal"/>
+    <w:next w:val="Normal"/>
+    <w:qFormat/>
+    <w:rPr>
+      <w:color w:val="2E74B5"/>
+      <w:sz w:val="32"/>
+      <w:szCs w:val="32"/>
+    </w:rPr>
+  </w:style>
+  <w:style w:type="paragraph" w:styleId="Heading2">
+    <w:name w:val="Heading 2"/>
+    <w:basedOn w:val="Normal"/>
+    <w:next w:val="Normal"/>
+    <w:qFormat/>
+    <w:rPr>
+      <w:color w:val="2E74B5"/>
+      <w:sz w:val="26"/>
+      <w:szCs w:val="26"/>
+    </w:rPr>
+  </w:style>
+  <w:style w:type="paragraph" w:styleId="Heading3">
+    <w:name w:val="Heading 3"/>
+    <w:basedOn w:val="Normal"/>
+    <w:next w:val="Normal"/>
+    <w:qFormat/>
+    <w:rPr>
+      <w:color w:val="1F4D78"/>
+      <w:sz w:val="24"/>
+      <w:szCs w:val="24"/>
+    </w:rPr>
+  </w:style>
+  <w:style w:type="paragraph" w:styleId="Heading4">
+    <w:name w:val="Heading 4"/>
+    <w:basedOn w:val="Normal"/>
+    <w:next w:val="Normal"/>
+    <w:qFormat/>
+    <w:rPr>
+      <w:i/>
+      <w:iCs/>
+      <w:color w:val="2E74B5"/>
     </w:rPr>
   </w:style>
   <w:style w:type="paragraph" w:styleId="Heading5">
@@ -4708,139 +4686,6 @@
     <w:name w:val="List Paragraph"/>
     <w:basedOn w:val="Normal"/>
     <w:qFormat/>
-  </w:style>
-  <w:style w:type="paragraph" w:styleId="Caption">
-    <w:name w:val="caption"/>
-    <w:basedOn w:val="Normal"/>
-    <w:next w:val="Normal"/>
-    <w:uiPriority w:val="35"/>
-    <w:semiHidden/>
-    <w:unhideWhenUsed/>
-    <w:qFormat/>
-    <w:pPr>
-      <w:spacing w:after="200"/>
-    </w:pPr>
-    <w:rPr>
-      <w:i/>
-      <w:iCs/>
-      <w:color w:val="44546A" w:themeColor="dark2"/>
-      <w:sz w:val="18"/>
-      <w:szCs w:val="18"/>
-    </w:rPr>
-  </w:style>
-  <w:style w:type="paragraph" w:styleId="Bibliography">
-    <w:name w:val="Bibliography"/>
-    <w:basedOn w:val="Normal"/>
-    <w:next w:val="Normal"/>
-    <w:uiPriority w:val="37"/>
-    <w:unhideWhenUsed/>
-  </w:style>
-  <w:style w:type="paragraph" w:styleId="TOC1">
-    <w:name w:val="toc 1"/>
-    <w:basedOn w:val="Normal"/>
-    <w:next w:val="Normal"/>
-    <w:uiPriority w:val="39"/>
-    <w:semiHidden/>
-    <w:unhideWhenUsed/>
-    <w:pPr>
-      <w:spacing w:after="100"/>
-    </w:pPr>
-  </w:style>
-  <w:style w:type="paragraph" w:styleId="TOC2">
-    <w:name w:val="toc 2"/>
-    <w:basedOn w:val="Normal"/>
-    <w:next w:val="Normal"/>
-    <w:uiPriority w:val="39"/>
-    <w:semiHidden/>
-    <w:unhideWhenUsed/>
-    <w:pPr>
-      <w:spacing w:after="100"/>
-      <w:ind w:left="220"/>
-    </w:pPr>
-  </w:style>
-  <w:style w:type="paragraph" w:styleId="TOC3">
-    <w:name w:val="toc 3"/>
-    <w:basedOn w:val="Normal"/>
-    <w:next w:val="Normal"/>
-    <w:uiPriority w:val="39"/>
-    <w:semiHidden/>
-    <w:unhideWhenUsed/>
-    <w:pPr>
-      <w:spacing w:after="100"/>
-      <w:ind w:left="440"/>
-    </w:pPr>
-  </w:style>
-  <w:style w:type="paragraph" w:styleId="TOC4">
-    <w:name w:val="toc 4"/>
-    <w:basedOn w:val="Normal"/>
-    <w:next w:val="Normal"/>
-    <w:uiPriority w:val="39"/>
-    <w:semiHidden/>
-    <w:unhideWhenUsed/>
-    <w:pPr>
-      <w:spacing w:after="100"/>
-      <w:ind w:left="660"/>
-    </w:pPr>
-  </w:style>
-  <w:style w:type="paragraph" w:styleId="TOC5">
-    <w:name w:val="toc 5"/>
-    <w:basedOn w:val="Normal"/>
-    <w:next w:val="Normal"/>
-    <w:uiPriority w:val="39"/>
-    <w:semiHidden/>
-    <w:unhideWhenUsed/>
-    <w:pPr>
-      <w:spacing w:after="100"/>
-      <w:ind w:left="880"/>
-    </w:pPr>
-  </w:style>
-  <w:style w:type="paragraph" w:styleId="TOC6">
-    <w:name w:val="toc 6"/>
-    <w:basedOn w:val="Normal"/>
-    <w:next w:val="Normal"/>
-    <w:uiPriority w:val="39"/>
-    <w:semiHidden/>
-    <w:unhideWhenUsed/>
-    <w:pPr>
-      <w:spacing w:after="100"/>
-      <w:ind w:left="1100"/>
-    </w:pPr>
-  </w:style>
-  <w:style w:type="paragraph" w:styleId="TOC7">
-    <w:name w:val="toc 7"/>
-    <w:basedOn w:val="Normal"/>
-    <w:next w:val="Normal"/>
-    <w:uiPriority w:val="39"/>
-    <w:semiHidden/>
-    <w:unhideWhenUsed/>
-    <w:pPr>
-      <w:spacing w:after="100"/>
-      <w:ind w:left="1320"/>
-    </w:pPr>
-  </w:style>
-  <w:style w:type="paragraph" w:styleId="TOC8">
-    <w:name w:val="toc 8"/>
-    <w:basedOn w:val="Normal"/>
-    <w:next w:val="Normal"/>
-    <w:uiPriority w:val="39"/>
-    <w:semiHidden/>
-    <w:unhideWhenUsed/>
-    <w:pPr>
-      <w:spacing w:after="100"/>
-      <w:ind w:left="1540"/>
-    </w:pPr>
-  </w:style>
-  <w:style w:type="paragraph" w:styleId="TOC9">
-    <w:name w:val="toc 9"/>
-    <w:basedOn w:val="Normal"/>
-    <w:next w:val="Normal"/>
-    <w:uiPriority w:val="39"/>
-    <w:semiHidden/>
-    <w:unhideWhenUsed/>
-    <w:pPr>
-      <w:spacing w:after="100"/>
-      <w:ind w:left="1760"/>
-    </w:pPr>
   </w:style>
   <w:style w:type="character" w:styleId="Hyperlink">
     <w:name w:val="Hyperlink"/>
@@ -4888,50 +4733,6 @@
       <w:sz w:val="20"/>
       <w:szCs w:val="20"/>
     </w:rPr>
-  </w:style>
-  <w:style w:type="character" w:styleId="EndnoteReference">
-    <w:name w:val="endnote reference"/>
-    <w:basedOn w:val="DefaultParagraphFont"/>
-    <w:uiPriority w:val="99"/>
-    <w:semiHidden/>
-    <w:unhideWhenUsed/>
-    <w:rPr>
-      <w:vertAlign w:val="superscript"/>
-    </w:rPr>
-  </w:style>
-  <w:style w:type="paragraph" w:styleId="EndnoteText">
-    <w:name w:val="endnote text"/>
-    <w:basedOn w:val="Normal"/>
-    <w:link w:val="EndnoteTextChar"/>
-    <w:uiPriority w:val="99"/>
-    <w:semiHidden/>
-    <w:unhideWhenUsed/>
-    <w:pPr>
-      <w:spacing w:after="0" w:line="240" w:lineRule="auto"/>
-    </w:pPr>
-    <w:rPr>
-      <w:sz w:val="20"/>
-      <w:szCs w:val="20"/>
-    </w:rPr>
-  </w:style>
-  <w:style w:type="character" w:styleId="EndnoteTextChar">
-    <w:name w:val="Endnote Text Char"/>
-    <w:basedOn w:val="DefaultParagraphFont"/>
-    <w:link w:val="EndnoteText"/>
-    <w:uiPriority w:val="99"/>
-    <w:semiHidden/>
-    <w:unhideWhenUsed/>
-    <w:rPr>
-      <w:sz w:val="20"/>
-      <w:szCs w:val="20"/>
-    </w:rPr>
-  </w:style>
-  <w:style w:type="character" w:styleId="LineNumber">
-    <w:name w:val="line number"/>
-    <w:basedOn w:val="DefaultParagraphFont"/>
-    <w:uiPriority w:val="99"/>
-    <w:semiHidden/>
-    <w:unhideWhenUsed/>
   </w:style>
   <w:style w:type="paragraph" w:styleId="Heading1">
     <w:name w:val="Heading 1"/>
@@ -4990,294 +4791,4 @@
     </w:rPr>
   </w:style>
 </w:styles>
-</file>
-
-<file path=word/theme/theme1.xml><?xml version="1.0" encoding="utf-8"?>
-<a:theme xmlns:a="http://schemas.openxmlformats.org/drawingml/2006/main" name="Office Theme">
-  <a:themeElements>
-    <a:clrScheme name="Office">
-      <a:dk1>
-        <a:sysClr val="windowText" lastClr="000000"/>
-      </a:dk1>
-      <a:lt1>
-        <a:sysClr val="window" lastClr="FFFFFF"/>
-      </a:lt1>
-      <a:dk2>
-        <a:srgbClr val="44546A"/>
-      </a:dk2>
-      <a:lt2>
-        <a:srgbClr val="E7E6E6"/>
-      </a:lt2>
-      <a:accent1>
-        <a:srgbClr val="4472C4"/>
-      </a:accent1>
-      <a:accent2>
-        <a:srgbClr val="ED7D31"/>
-      </a:accent2>
-      <a:accent3>
-        <a:srgbClr val="A5A5A5"/>
-      </a:accent3>
-      <a:accent4>
-        <a:srgbClr val="FFC000"/>
-      </a:accent4>
-      <a:accent5>
-        <a:srgbClr val="5B9BD5"/>
-      </a:accent5>
-      <a:accent6>
-        <a:srgbClr val="70AD47"/>
-      </a:accent6>
-      <a:hlink>
-        <a:srgbClr val="0563C1"/>
-      </a:hlink>
-      <a:folHlink>
-        <a:srgbClr val="954F72"/>
-      </a:folHlink>
-    </a:clrScheme>
-    <a:fontScheme name="Office">
-      <a:majorFont>
-        <a:latin typeface="Calibri Light" panose="020F0302020204030204"/>
-        <a:ea typeface=""/>
-        <a:cs typeface=""/>
-        <a:font script="Jpan" typeface="游ゴシック Light"/>
-        <a:font script="Hang" typeface="맑은 고딕"/>
-        <a:font script="Hans" typeface="等线 Light"/>
-        <a:font script="Hant" typeface="新細明體"/>
-        <a:font script="Arab" typeface="Times New Roman"/>
-        <a:font script="Hebr" typeface="Times New Roman"/>
-        <a:font script="Thai" typeface="Angsana New"/>
-        <a:font script="Ethi" typeface="Nyala"/>
-        <a:font script="Beng" typeface="Vrinda"/>
-        <a:font script="Gujr" typeface="Shruti"/>
-        <a:font script="Khmr" typeface="MoolBoran"/>
-        <a:font script="Knda" typeface="Tunga"/>
-        <a:font script="Guru" typeface="Raavi"/>
-        <a:font script="Cans" typeface="Euphemia"/>
-        <a:font script="Cher" typeface="Plantagenet Cherokee"/>
-        <a:font script="Yiii" typeface="Microsoft Yi Baiti"/>
-        <a:font script="Tibt" typeface="Microsoft Himalaya"/>
-        <a:font script="Thaa" typeface="MV Boli"/>
-        <a:font script="Deva" typeface="Mangal"/>
-        <a:font script="Telu" typeface="Gautami"/>
-        <a:font script="Taml" typeface="Latha"/>
-        <a:font script="Syrc" typeface="Estrangelo Edessa"/>
-        <a:font script="Orya" typeface="Kalinga"/>
-        <a:font script="Mlym" typeface="Kartika"/>
-        <a:font script="Laoo" typeface="DokChampa"/>
-        <a:font script="Sinh" typeface="Iskoola Pota"/>
-        <a:font script="Mong" typeface="Mongolian Baiti"/>
-        <a:font script="Viet" typeface="Times New Roman"/>
-        <a:font script="Uigh" typeface="Microsoft Uighur"/>
-        <a:font script="Geor" typeface="Sylfaen"/>
-        <a:font script="Armn" typeface="Arial"/>
-        <a:font script="Bugi" typeface="Leelawadee UI"/>
-        <a:font script="Bopo" typeface="Microsoft JhengHei"/>
-        <a:font script="Java" typeface="Javanese Text"/>
-        <a:font script="Lisu" typeface="Segoe UI"/>
-        <a:font script="Mymr" typeface="Myanmar Text"/>
-        <a:font script="Nkoo" typeface="Ebrima"/>
-        <a:font script="Olck" typeface="Nirmala UI"/>
-        <a:font script="Osma" typeface="Ebrima"/>
-        <a:font script="Phag" typeface="Phagspa"/>
-        <a:font script="Syrn" typeface="Estrangelo Edessa"/>
-        <a:font script="Syrj" typeface="Estrangelo Edessa"/>
-        <a:font script="Syre" typeface="Estrangelo Edessa"/>
-        <a:font script="Sora" typeface="Nirmala UI"/>
-        <a:font script="Tale" typeface="Microsoft Tai Le"/>
-        <a:font script="Talu" typeface="Microsoft New Tai Lue"/>
-        <a:font script="Tfng" typeface="Ebrima"/>
-      </a:majorFont>
-      <a:minorFont>
-        <a:latin typeface="Calibri" panose="020F0502020204030204"/>
-        <a:ea typeface=""/>
-        <a:cs typeface=""/>
-        <a:font script="Jpan" typeface="游明朝"/>
-        <a:font script="Hang" typeface="맑은 고딕"/>
-        <a:font script="Hans" typeface="等线"/>
-        <a:font script="Hant" typeface="新細明體"/>
-        <a:font script="Arab" typeface="Arial"/>
-        <a:font script="Hebr" typeface="Arial"/>
-        <a:font script="Thai" typeface="Cordia New"/>
-        <a:font script="Ethi" typeface="Nyala"/>
-        <a:font script="Beng" typeface="Vrinda"/>
-        <a:font script="Gujr" typeface="Shruti"/>
-        <a:font script="Khmr" typeface="DaunPenh"/>
-        <a:font script="Knda" typeface="Tunga"/>
-        <a:font script="Guru" typeface="Raavi"/>
-        <a:font script="Cans" typeface="Euphemia"/>
-        <a:font script="Cher" typeface="Plantagenet Cherokee"/>
-        <a:font script="Yiii" typeface="Microsoft Yi Baiti"/>
-        <a:font script="Tibt" typeface="Microsoft Himalaya"/>
-        <a:font script="Thaa" typeface="MV Boli"/>
-        <a:font script="Deva" typeface="Mangal"/>
-        <a:font script="Telu" typeface="Gautami"/>
-        <a:font script="Taml" typeface="Latha"/>
-        <a:font script="Syrc" typeface="Estrangelo Edessa"/>
-        <a:font script="Orya" typeface="Kalinga"/>
-        <a:font script="Mlym" typeface="Kartika"/>
-        <a:font script="Laoo" typeface="DokChampa"/>
-        <a:font script="Sinh" typeface="Iskoola Pota"/>
-        <a:font script="Mong" typeface="Mongolian Baiti"/>
-        <a:font script="Viet" typeface="Arial"/>
-        <a:font script="Uigh" typeface="Microsoft Uighur"/>
-        <a:font script="Geor" typeface="Sylfaen"/>
-        <a:font script="Armn" typeface="Arial"/>
-        <a:font script="Bugi" typeface="Leelawadee UI"/>
-        <a:font script="Bopo" typeface="Microsoft JhengHei"/>
-        <a:font script="Java" typeface="Javanese Text"/>
-        <a:font script="Lisu" typeface="Segoe UI"/>
-        <a:font script="Mymr" typeface="Myanmar Text"/>
-        <a:font script="Nkoo" typeface="Ebrima"/>
-        <a:font script="Olck" typeface="Nirmala UI"/>
-        <a:font script="Osma" typeface="Ebrima"/>
-        <a:font script="Phag" typeface="Phagspa"/>
-        <a:font script="Syrn" typeface="Estrangelo Edessa"/>
-        <a:font script="Syrj" typeface="Estrangelo Edessa"/>
-        <a:font script="Syre" typeface="Estrangelo Edessa"/>
-        <a:font script="Sora" typeface="Nirmala UI"/>
-        <a:font script="Tale" typeface="Microsoft Tai Le"/>
-        <a:font script="Talu" typeface="Microsoft New Tai Lue"/>
-        <a:font script="Tfng" typeface="Ebrima"/>
-      </a:minorFont>
-    </a:fontScheme>
-    <a:fmtScheme name="Office">
-      <a:fillStyleLst>
-        <a:solidFill>
-          <a:schemeClr val="phClr"/>
-        </a:solidFill>
-        <a:gradFill rotWithShape="true">
-          <a:gsLst>
-            <a:gs pos="0">
-              <a:schemeClr val="phClr">
-                <a:lumMod val="110000"/>
-                <a:satMod val="105000"/>
-                <a:tint val="67000"/>
-              </a:schemeClr>
-            </a:gs>
-            <a:gs pos="50000">
-              <a:schemeClr val="phClr">
-                <a:lumMod val="105000"/>
-                <a:satMod val="103000"/>
-                <a:tint val="73000"/>
-              </a:schemeClr>
-            </a:gs>
-            <a:gs pos="100000">
-              <a:schemeClr val="phClr">
-                <a:lumMod val="105000"/>
-                <a:satMod val="109000"/>
-                <a:tint val="81000"/>
-              </a:schemeClr>
-            </a:gs>
-          </a:gsLst>
-          <a:lin ang="5400000" scaled="false"/>
-        </a:gradFill>
-        <a:gradFill rotWithShape="true">
-          <a:gsLst>
-            <a:gs pos="0">
-              <a:schemeClr val="phClr">
-                <a:satMod val="103000"/>
-                <a:lumMod val="102000"/>
-                <a:tint val="94000"/>
-              </a:schemeClr>
-            </a:gs>
-            <a:gs pos="50000">
-              <a:schemeClr val="phClr">
-                <a:satMod val="110000"/>
-                <a:lumMod val="100000"/>
-                <a:shade val="100000"/>
-              </a:schemeClr>
-            </a:gs>
-            <a:gs pos="100000">
-              <a:schemeClr val="phClr">
-                <a:lumMod val="99000"/>
-                <a:satMod val="120000"/>
-                <a:shade val="78000"/>
-              </a:schemeClr>
-            </a:gs>
-          </a:gsLst>
-          <a:lin ang="5400000" scaled="false"/>
-        </a:gradFill>
-      </a:fillStyleLst>
-      <a:lnStyleLst>
-        <a:ln w="6350" cap="flat" cmpd="sng" algn="ctr">
-          <a:solidFill>
-            <a:schemeClr val="phClr"/>
-          </a:solidFill>
-          <a:prstDash val="solid"/>
-          <a:miter lim="800000"/>
-        </a:ln>
-        <a:ln w="12700" cap="flat" cmpd="sng" algn="ctr">
-          <a:solidFill>
-            <a:schemeClr val="phClr"/>
-          </a:solidFill>
-          <a:prstDash val="solid"/>
-          <a:miter lim="800000"/>
-        </a:ln>
-        <a:ln w="19050" cap="flat" cmpd="sng" algn="ctr">
-          <a:solidFill>
-            <a:schemeClr val="phClr"/>
-          </a:solidFill>
-          <a:prstDash val="solid"/>
-          <a:miter lim="800000"/>
-        </a:ln>
-      </a:lnStyleLst>
-      <a:effectStyleLst>
-        <a:effectStyle>
-          <a:effectLst/>
-        </a:effectStyle>
-        <a:effectStyle>
-          <a:effectLst/>
-        </a:effectStyle>
-        <a:effectStyle>
-          <a:effectLst>
-            <a:outerShdw blurRad="57150" dist="19050" dir="5400000" algn="ctr" rotWithShape="false">
-              <a:srgbClr val="000000">
-                <a:alpha val="63000"/>
-              </a:srgbClr>
-            </a:outerShdw>
-          </a:effectLst>
-        </a:effectStyle>
-      </a:effectStyleLst>
-      <a:bgFillStyleLst>
-        <a:solidFill>
-          <a:schemeClr val="phClr"/>
-        </a:solidFill>
-        <a:solidFill>
-          <a:schemeClr val="phClr">
-            <a:tint val="95000"/>
-            <a:satMod val="170000"/>
-          </a:schemeClr>
-        </a:solidFill>
-        <a:gradFill rotWithShape="true">
-          <a:gsLst>
-            <a:gs pos="0">
-              <a:schemeClr val="phClr">
-                <a:tint val="93000"/>
-                <a:satMod val="150000"/>
-                <a:shade val="98000"/>
-                <a:lumMod val="102000"/>
-              </a:schemeClr>
-            </a:gs>
-            <a:gs pos="50000">
-              <a:schemeClr val="phClr">
-                <a:tint val="98000"/>
-                <a:satMod val="130000"/>
-                <a:shade val="90000"/>
-                <a:lumMod val="103000"/>
-              </a:schemeClr>
-            </a:gs>
-            <a:gs pos="100000">
-              <a:schemeClr val="phClr">
-                <a:shade val="63000"/>
-                <a:satMod val="120000"/>
-              </a:schemeClr>
-            </a:gs>
-          </a:gsLst>
-          <a:lin ang="5400000" scaled="false"/>
-        </a:gradFill>
-      </a:bgFillStyleLst>
-    </a:fmtScheme>
-  </a:themeElements>
-  <a:objectDefaults/>
-  <a:extraClrSchemeLst/>
-</a:theme>
 </file>
</xml_diff>